<commit_message>
Subindo arquivos do projeto Django
</commit_message>
<xml_diff>
--- a/documento_com_tpl.docx
+++ b/documento_com_tpl.docx
@@ -343,7 +343,7 @@
           <w:sz w:val="24"/>
           <w:szCs w:val="24"/>
         </w:rPr>
-        <w:t xml:space="preserve">2025</w:t>
+        <w:t xml:space="preserve">2026</w:t>
       </w:r>
     </w:p>
     <w:p>
@@ -462,7 +462,7 @@
                                 <w:sz w:val="24"/>
                                 <w:szCs w:val="24"/>
                               </w:rPr>
-                              <w:t xml:space="preserve">4º COMANDO REGIONAL</w:t>
+                              <w:t xml:space="preserve"/>
                             </w:r>
                           </w:p>
                           <w:p>
@@ -484,7 +484,7 @@
                                 <w:sz w:val="24"/>
                                 <w:szCs w:val="24"/>
                               </w:rPr>
-                              <w:t xml:space="preserve">5º BATALHÃO DE POLÍCIA MILITAR</w:t>
+                              <w:t xml:space="preserve"/>
                             </w:r>
                           </w:p>
                         </w:txbxContent>
@@ -549,7 +549,7 @@
                           <w:sz w:val="24"/>
                           <w:szCs w:val="24"/>
                         </w:rPr>
-                        <w:t xml:space="preserve">4º COMANDO REGIONAL</w:t>
+                        <w:t xml:space="preserve"/>
                       </w:r>
                     </w:p>
                     <w:p>
@@ -570,7 +570,7 @@
                           <w:sz w:val="24"/>
                           <w:szCs w:val="24"/>
                         </w:rPr>
-                        <w:t xml:space="preserve">5º BATALHÃO DE POLÍCIA MILITAR</w:t>
+                        <w:t xml:space="preserve"/>
                       </w:r>
                     </w:p>
                   </w:txbxContent>
@@ -913,7 +913,7 @@
                                 <w:sz w:val="30"/>
                                 <w:lang w:val="en-US"/>
                               </w:rPr>
-                              <w:t xml:space="preserve">2025</w:t>
+                              <w:t xml:space="preserve">2026</w:t>
                             </w:r>
                           </w:p>
                         </w:txbxContent>
@@ -963,7 +963,7 @@
                           <w:sz w:val="30"/>
                           <w:lang w:val="en-US"/>
                         </w:rPr>
-                        <w:t xml:space="preserve">2025</w:t>
+                        <w:t xml:space="preserve">2026</w:t>
                       </w:r>
                     </w:p>
                   </w:txbxContent>

</xml_diff>